<commit_message>
Read the verify queue counts off the screen, do not recite them
Act two writes a new recommendation on every run, so the queue grows with
each rehearsal and the banner recalculates. The sheet said "eight of
these twelve" as if it were fixed. Same rule as the floor score: a
presenter reading their own screen is believed, one reciting a number
that no longer matches is not.

Five people is the figure the line rests on, and that one holds, because
new cards land on staff already in the cluster.

Co-Authored-By: Claude Opus 5 <noreply@anthropic.com>
</commit_message>
<xml_diff>
--- a/Demo-Run-Sheet.docx
+++ b/Demo-Run-Sheet.docx
@@ -2877,7 +2877,7 @@
                 <w:sz w:val="19"/>
                 <w:szCs w:val="19"/>
               </w:rPr>
-              <w:t xml:space="preserve">Scroll back up to the green banner.</w:t>
+              <w:t xml:space="preserve">Scroll back up to the green banner. READ IT OFF THE SCREEN.</w:t>
             </w:r>
           </w:p>
           <w:p>
@@ -2903,7 +2903,7 @@
                 <w:sz w:val="19"/>
                 <w:szCs w:val="19"/>
               </w:rPr>
-              <w:t xml:space="preserve">8 of these 12 say the same thing. 5 people, the same missing authority.</w:t>
+              <w:t xml:space="preserve">N of these M say the same thing. 5 people, the same missing authority.</w:t>
             </w:r>
           </w:p>
         </w:tc>
@@ -2956,6 +2956,23 @@
         </w:tc>
       </w:tr>
     </w:tbl>
+    <w:p>
+      <w:pPr>
+        <w:spacing w:after="200" w:before="100"/>
+        <w:ind w:left="3440"/>
+      </w:pPr>
+      <w:r>
+        <w:rPr>
+          <w:rFonts w:ascii="Calibri" w:cs="Calibri" w:eastAsia="Calibri" w:hAnsi="Calibri"/>
+          <w:i/>
+          <w:iCs/>
+          <w:color w:val="5A6472"/>
+          <w:sz w:val="18"/>
+          <w:szCs w:val="18"/>
+        </w:rPr>
+        <w:t xml:space="preserve">The two counts move every time you rehearse, because act two writes a new recommendation on every run. Read them, do not recite them. The number that holds is five people, and that is the one the line rests on.</w:t>
+      </w:r>
+    </w:p>
     <w:tbl>
       <w:tblPr>
         <w:tblW w:type="dxa" w:w="9638"/>

</xml_diff>

<commit_message>
Read every number in the banner line off the screen
The queue moved: ten pending now, six of them the policy cluster across
four people, because a verdict was recorded during testing. The script
said "eight of these twelve, five different people" as though those were
constants.

The previous commit claimed the people count holds because new cards
land on staff already in the cluster. That is wrong. Deciding a card can
remove a person from the cluster, and it did.

The people number appears twice in that line, as the count and as the
number of conversations, so the two have to be read together.

Co-Authored-By: Claude Opus 5 <noreply@anthropic.com>
</commit_message>
<xml_diff>
--- a/Demo-Run-Sheet.docx
+++ b/Demo-Run-Sheet.docx
@@ -2932,7 +2932,25 @@
                 <w:sz w:val="24"/>
                 <w:szCs w:val="24"/>
               </w:rPr>
-              <w:t xml:space="preserve">And this is where it stops being about Diego. Eight of these twelve say the same thing. Five different people, the same missing authority.</w:t>
+              <w:t xml:space="preserve">And this is where it stops being about Diego.</w:t>
+            </w:r>
+          </w:p>
+          <w:p>
+            <w:pPr>
+              <w:spacing w:after="140"/>
+            </w:pPr>
+            <w:r>
+              <w:rPr>
+                <w:rFonts w:ascii="Calibri" w:cs="Calibri" w:eastAsia="Calibri" w:hAnsi="Calibri"/>
+                <w:b w:val="false"/>
+                <w:bCs w:val="false"/>
+                <w:i/>
+                <w:iCs/>
+                <w:color w:val="5B4B8A"/>
+                <w:sz w:val="22"/>
+                <w:szCs w:val="22"/>
+              </w:rPr>
+              <w:t xml:space="preserve">[read the banner]  N of these M say the same thing. P different people, the same missing authority.</w:t>
             </w:r>
           </w:p>
           <w:p>
@@ -2950,7 +2968,7 @@
                 <w:sz w:val="24"/>
                 <w:szCs w:val="24"/>
               </w:rPr>
-              <w:t xml:space="preserve">That is one policy to write, not five conversations to have.</w:t>
+              <w:t xml:space="preserve">That is one policy to write, not P conversations to have.</w:t>
             </w:r>
           </w:p>
         </w:tc>
@@ -2970,7 +2988,7 @@
           <w:sz w:val="18"/>
           <w:szCs w:val="18"/>
         </w:rPr>
-        <w:t xml:space="preserve">The two counts move every time you rehearse, because act two writes a new recommendation on every run. Read them, do not recite them. The number that holds is five people, and that is the one the line rests on.</w:t>
+        <w:t xml:space="preserve">Every number here moves. Act two writes a new card on each run, and deciding a card can drop a person out of the cluster entirely. As of 13 Sept it reads 6 of 10, 4 people. Read all three off the screen, and say the people number twice: once as the count, once as the conversations.</w:t>
       </w:r>
     </w:p>
     <w:tbl>

</xml_diff>

<commit_message>
Direct the performance, not just the words
The video runs itself, so the only thing the room is watching is the
person beside it, and neither document said anything about what that
person should do.

Every beat now carries a stage direction: where to stand, which words to
gesture on, which gear to speak in, and which two seconds to say nothing
at all. Three gestures only, because a pitch with choreography in it
reads as rehearsed.

The direction is deliberately specific where it matters and absent where
it does not. Turning away from the screen on "training worked" is worth
writing down. Nothing else in the demo is delivered to their faces.

Co-Authored-By: Claude Opus 5 <noreply@anthropic.com>
</commit_message>
<xml_diff>
--- a/Demo-Run-Sheet.docx
+++ b/Demo-Run-Sheet.docx
@@ -464,7 +464,7 @@
           </w:tcPr>
           <w:p>
             <w:pPr>
-              <w:spacing w:after="0"/>
+              <w:spacing w:after="80"/>
             </w:pPr>
             <w:r>
               <w:rPr>
@@ -486,6 +486,32 @@
                 <w:szCs w:val="19"/>
               </w:rPr>
               <w:t xml:space="preserve">Training shows completion. This shows what changed on the floor.</w:t>
+            </w:r>
+          </w:p>
+          <w:p>
+            <w:pPr>
+              <w:spacing w:after="0"/>
+            </w:pPr>
+            <w:r>
+              <w:rPr>
+                <w:rFonts w:ascii="Calibri" w:cs="Calibri" w:eastAsia="Calibri" w:hAnsi="Calibri"/>
+                <w:b/>
+                <w:bCs/>
+                <w:caps/>
+                <w:color w:val="5B4B8A"/>
+                <w:sz w:val="18"/>
+                <w:szCs w:val="18"/>
+              </w:rPr>
+              <w:t xml:space="preserve">YOU  </w:t>
+            </w:r>
+            <w:r>
+              <w:rPr>
+                <w:rFonts w:ascii="Calibri" w:cs="Calibri" w:eastAsia="Calibri" w:hAnsi="Calibri"/>
+                <w:color w:val="1A2233"/>
+                <w:sz w:val="19"/>
+                <w:szCs w:val="19"/>
+              </w:rPr>
+              <w:t xml:space="preserve">Stand BESIDE the screen, not in front. Do not look at it. You know what it says; they do not know you yet.</w:t>
             </w:r>
           </w:p>
         </w:tc>
@@ -614,7 +640,7 @@
           </w:tcPr>
           <w:p>
             <w:pPr>
-              <w:spacing w:after="0"/>
+              <w:spacing w:after="80"/>
             </w:pPr>
             <w:r>
               <w:rPr>
@@ -636,6 +662,32 @@
                 <w:szCs w:val="19"/>
               </w:rPr>
               <w:t xml:space="preserve">His own words, the hotel's Escalation Rule 1 quoted, and "Why you're seeing this".</w:t>
+            </w:r>
+          </w:p>
+          <w:p>
+            <w:pPr>
+              <w:spacing w:after="0"/>
+            </w:pPr>
+            <w:r>
+              <w:rPr>
+                <w:rFonts w:ascii="Calibri" w:cs="Calibri" w:eastAsia="Calibri" w:hAnsi="Calibri"/>
+                <w:b/>
+                <w:bCs/>
+                <w:caps/>
+                <w:color w:val="5B4B8A"/>
+                <w:sz w:val="18"/>
+                <w:szCs w:val="18"/>
+              </w:rPr>
+              <w:t xml:space="preserve">YOU  </w:t>
+            </w:r>
+            <w:r>
+              <w:rPr>
+                <w:rFonts w:ascii="Calibri" w:cs="Calibri" w:eastAsia="Calibri" w:hAnsi="Calibri"/>
+                <w:color w:val="1A2233"/>
+                <w:sz w:val="19"/>
+                <w:szCs w:val="19"/>
+              </w:rPr>
+              <w:t xml:space="preserve">On the words their manual, tap the screen once at the quote. One tap, then hand down.</w:t>
             </w:r>
           </w:p>
         </w:tc>
@@ -782,7 +834,7 @@
           </w:tcPr>
           <w:p>
             <w:pPr>
-              <w:spacing w:after="0"/>
+              <w:spacing w:after="80"/>
             </w:pPr>
             <w:r>
               <w:rPr>
@@ -804,6 +856,32 @@
                 <w:szCs w:val="19"/>
               </w:rPr>
               <w:t xml:space="preserve">The guest, Diego's reply, then "the guest seems satisfied".</w:t>
+            </w:r>
+          </w:p>
+          <w:p>
+            <w:pPr>
+              <w:spacing w:after="0"/>
+            </w:pPr>
+            <w:r>
+              <w:rPr>
+                <w:rFonts w:ascii="Calibri" w:cs="Calibri" w:eastAsia="Calibri" w:hAnsi="Calibri"/>
+                <w:b/>
+                <w:bCs/>
+                <w:caps/>
+                <w:color w:val="5B4B8A"/>
+                <w:sz w:val="18"/>
+                <w:szCs w:val="18"/>
+              </w:rPr>
+              <w:t xml:space="preserve">YOU  </w:t>
+            </w:r>
+            <w:r>
+              <w:rPr>
+                <w:rFonts w:ascii="Calibri" w:cs="Calibri" w:eastAsia="Calibri" w:hAnsi="Calibri"/>
+                <w:color w:val="1A2233"/>
+                <w:sz w:val="19"/>
+                <w:szCs w:val="19"/>
+              </w:rPr>
+              <w:t xml:space="preserve">Count the three offers on your fingers as you say them. Bags. Coffee. A time.</w:t>
             </w:r>
           </w:p>
         </w:tc>
@@ -958,7 +1036,7 @@
           </w:p>
           <w:p>
             <w:pPr>
-              <w:spacing w:after="0"/>
+              <w:spacing w:after="80"/>
             </w:pPr>
             <w:r>
               <w:rPr>
@@ -980,6 +1058,32 @@
                 <w:szCs w:val="19"/>
               </w:rPr>
               <w:t xml:space="preserve">STOP TALKING for two seconds.</w:t>
+            </w:r>
+          </w:p>
+          <w:p>
+            <w:pPr>
+              <w:spacing w:after="0"/>
+            </w:pPr>
+            <w:r>
+              <w:rPr>
+                <w:rFonts w:ascii="Calibri" w:cs="Calibri" w:eastAsia="Calibri" w:hAnsi="Calibri"/>
+                <w:b/>
+                <w:bCs/>
+                <w:caps/>
+                <w:color w:val="5B4B8A"/>
+                <w:sz w:val="18"/>
+                <w:szCs w:val="18"/>
+              </w:rPr>
+              <w:t xml:space="preserve">YOU  </w:t>
+            </w:r>
+            <w:r>
+              <w:rPr>
+                <w:rFonts w:ascii="Calibri" w:cs="Calibri" w:eastAsia="Calibri" w:hAnsi="Calibri"/>
+                <w:color w:val="1A2233"/>
+                <w:sz w:val="19"/>
+                <w:szCs w:val="19"/>
+              </w:rPr>
+              <w:t xml:space="preserve">Say it flat, almost bored. You are setting a trap and you do not want them to see it yet.</w:t>
             </w:r>
           </w:p>
         </w:tc>
@@ -1152,7 +1256,7 @@
           </w:p>
           <w:p>
             <w:pPr>
-              <w:spacing w:after="0"/>
+              <w:spacing w:after="80"/>
             </w:pPr>
             <w:r>
               <w:rPr>
@@ -1174,6 +1278,32 @@
                 <w:szCs w:val="19"/>
               </w:rPr>
               <w:t xml:space="preserve">Slow right down.</w:t>
+            </w:r>
+          </w:p>
+          <w:p>
+            <w:pPr>
+              <w:spacing w:after="0"/>
+            </w:pPr>
+            <w:r>
+              <w:rPr>
+                <w:rFonts w:ascii="Calibri" w:cs="Calibri" w:eastAsia="Calibri" w:hAnsi="Calibri"/>
+                <w:b/>
+                <w:bCs/>
+                <w:caps/>
+                <w:color w:val="5B4B8A"/>
+                <w:sz w:val="18"/>
+                <w:szCs w:val="18"/>
+              </w:rPr>
+              <w:t xml:space="preserve">YOU  </w:t>
+            </w:r>
+            <w:r>
+              <w:rPr>
+                <w:rFonts w:ascii="Calibri" w:cs="Calibri" w:eastAsia="Calibri" w:hAnsi="Calibri"/>
+                <w:color w:val="1A2233"/>
+                <w:sz w:val="19"/>
+                <w:szCs w:val="19"/>
+              </w:rPr>
+              <w:t xml:space="preserve">TURN AWAY from the screen and take one step toward them. Say training worked to their faces, not to the projector. It is the only line in the demo you deliver to the room.</w:t>
             </w:r>
           </w:p>
         </w:tc>
@@ -1337,7 +1467,7 @@
           </w:tcPr>
           <w:p>
             <w:pPr>
-              <w:spacing w:after="0"/>
+              <w:spacing w:after="80"/>
             </w:pPr>
             <w:r>
               <w:rPr>
@@ -1359,6 +1489,32 @@
                 <w:szCs w:val="19"/>
               </w:rPr>
               <w:t xml:space="preserve">Radar, verify queue, team patterns.</w:t>
+            </w:r>
+          </w:p>
+          <w:p>
+            <w:pPr>
+              <w:spacing w:after="0"/>
+            </w:pPr>
+            <w:r>
+              <w:rPr>
+                <w:rFonts w:ascii="Calibri" w:cs="Calibri" w:eastAsia="Calibri" w:hAnsi="Calibri"/>
+                <w:b/>
+                <w:bCs/>
+                <w:caps/>
+                <w:color w:val="5B4B8A"/>
+                <w:sz w:val="18"/>
+                <w:szCs w:val="18"/>
+              </w:rPr>
+              <w:t xml:space="preserve">YOU  </w:t>
+            </w:r>
+            <w:r>
+              <w:rPr>
+                <w:rFonts w:ascii="Calibri" w:cs="Calibri" w:eastAsia="Calibri" w:hAnsi="Calibri"/>
+                <w:color w:val="1A2233"/>
+                <w:sz w:val="19"/>
+                <w:szCs w:val="19"/>
+              </w:rPr>
+              <w:t xml:space="preserve">Back to neutral. Brisk. This is connective tissue, not a beat.</w:t>
             </w:r>
           </w:p>
         </w:tc>
@@ -1487,7 +1643,7 @@
           </w:tcPr>
           <w:p>
             <w:pPr>
-              <w:spacing w:after="0"/>
+              <w:spacing w:after="80"/>
             </w:pPr>
             <w:r>
               <w:rPr>
@@ -1509,6 +1665,32 @@
                 <w:szCs w:val="19"/>
               </w:rPr>
               <w:t xml:space="preserve">"He never actually offered her anything to fix it." Composure 4. And: one rating was thrown away for quoting words you did not say.</w:t>
+            </w:r>
+          </w:p>
+          <w:p>
+            <w:pPr>
+              <w:spacing w:after="0"/>
+            </w:pPr>
+            <w:r>
+              <w:rPr>
+                <w:rFonts w:ascii="Calibri" w:cs="Calibri" w:eastAsia="Calibri" w:hAnsi="Calibri"/>
+                <w:b/>
+                <w:bCs/>
+                <w:caps/>
+                <w:color w:val="5B4B8A"/>
+                <w:sz w:val="18"/>
+                <w:szCs w:val="18"/>
+              </w:rPr>
+              <w:t xml:space="preserve">YOU  </w:t>
+            </w:r>
+            <w:r>
+              <w:rPr>
+                <w:rFonts w:ascii="Calibri" w:cs="Calibri" w:eastAsia="Calibri" w:hAnsi="Calibri"/>
+                <w:color w:val="1A2233"/>
+                <w:sz w:val="19"/>
+                <w:szCs w:val="19"/>
+              </w:rPr>
+              <w:t xml:space="preserve">On the words and there, stop walking. Flat palm at the screen, hold two seconds, drop it. Let them find the line themselves.</w:t>
             </w:r>
           </w:p>
         </w:tc>
@@ -1655,7 +1837,7 @@
           </w:tcPr>
           <w:p>
             <w:pPr>
-              <w:spacing w:after="0"/>
+              <w:spacing w:after="80"/>
             </w:pPr>
             <w:r>
               <w:rPr>
@@ -1677,6 +1859,32 @@
                 <w:szCs w:val="19"/>
               </w:rPr>
               <w:t xml:space="preserve">Recovery 1. "Did they fix the problem for the guest? You added this one."</w:t>
+            </w:r>
+          </w:p>
+          <w:p>
+            <w:pPr>
+              <w:spacing w:after="0"/>
+            </w:pPr>
+            <w:r>
+              <w:rPr>
+                <w:rFonts w:ascii="Calibri" w:cs="Calibri" w:eastAsia="Calibri" w:hAnsi="Calibri"/>
+                <w:b/>
+                <w:bCs/>
+                <w:caps/>
+                <w:color w:val="5B4B8A"/>
+                <w:sz w:val="18"/>
+                <w:szCs w:val="18"/>
+              </w:rPr>
+              <w:t xml:space="preserve">YOU  </w:t>
+            </w:r>
+            <w:r>
+              <w:rPr>
+                <w:rFonts w:ascii="Calibri" w:cs="Calibri" w:eastAsia="Calibri" w:hAnsi="Calibri"/>
+                <w:color w:val="1A2233"/>
+                <w:sz w:val="19"/>
+                <w:szCs w:val="19"/>
+              </w:rPr>
+              <w:t xml:space="preserve">Warmer here. This is the human winning, and it should sound like you like her.</w:t>
             </w:r>
           </w:p>
         </w:tc>
@@ -1805,7 +2013,7 @@
           </w:tcPr>
           <w:p>
             <w:pPr>
-              <w:spacing w:after="0"/>
+              <w:spacing w:after="80"/>
             </w:pPr>
             <w:r>
               <w:rPr>
@@ -1827,6 +2035,32 @@
                 <w:szCs w:val="19"/>
               </w:rPr>
               <w:t xml:space="preserve">7 of these 11 say the same thing. 5 people, the same missing authority.</w:t>
+            </w:r>
+          </w:p>
+          <w:p>
+            <w:pPr>
+              <w:spacing w:after="0"/>
+            </w:pPr>
+            <w:r>
+              <w:rPr>
+                <w:rFonts w:ascii="Calibri" w:cs="Calibri" w:eastAsia="Calibri" w:hAnsi="Calibri"/>
+                <w:b/>
+                <w:bCs/>
+                <w:caps/>
+                <w:color w:val="5B4B8A"/>
+                <w:sz w:val="18"/>
+                <w:szCs w:val="18"/>
+              </w:rPr>
+              <w:t xml:space="preserve">YOU  </w:t>
+            </w:r>
+            <w:r>
+              <w:rPr>
+                <w:rFonts w:ascii="Calibri" w:cs="Calibri" w:eastAsia="Calibri" w:hAnsi="Calibri"/>
+                <w:color w:val="1A2233"/>
+                <w:sz w:val="19"/>
+                <w:szCs w:val="19"/>
+              </w:rPr>
+              <w:t xml:space="preserve">Hold up ONE finger on the words one policy, and keep it up through not five conversations. Cheapest gesture in the pitch and the one they remember.</w:t>
             </w:r>
           </w:p>
         </w:tc>
@@ -1973,7 +2207,7 @@
           </w:tcPr>
           <w:p>
             <w:pPr>
-              <w:spacing w:after="0"/>
+              <w:spacing w:after="80"/>
             </w:pPr>
             <w:r>
               <w:rPr>
@@ -1995,6 +2229,32 @@
                 <w:szCs w:val="19"/>
               </w:rPr>
               <w:t xml:space="preserve">Confirm / Correct / Reject, with the glass box open underneath.</w:t>
+            </w:r>
+          </w:p>
+          <w:p>
+            <w:pPr>
+              <w:spacing w:after="0"/>
+            </w:pPr>
+            <w:r>
+              <w:rPr>
+                <w:rFonts w:ascii="Calibri" w:cs="Calibri" w:eastAsia="Calibri" w:hAnsi="Calibri"/>
+                <w:b/>
+                <w:bCs/>
+                <w:caps/>
+                <w:color w:val="5B4B8A"/>
+                <w:sz w:val="18"/>
+                <w:szCs w:val="18"/>
+              </w:rPr>
+              <w:t xml:space="preserve">YOU  </w:t>
+            </w:r>
+            <w:r>
+              <w:rPr>
+                <w:rFonts w:ascii="Calibri" w:cs="Calibri" w:eastAsia="Calibri" w:hAnsi="Calibri"/>
+                <w:color w:val="1A2233"/>
+                <w:sz w:val="19"/>
+                <w:szCs w:val="19"/>
+              </w:rPr>
+              <w:t xml:space="preserve">Flat palm out, like stopping traffic, on the words and stopped. Then hands down and still.</w:t>
             </w:r>
           </w:p>
         </w:tc>
@@ -2123,7 +2383,7 @@
           </w:tcPr>
           <w:p>
             <w:pPr>
-              <w:spacing w:after="0"/>
+              <w:spacing w:after="80"/>
             </w:pPr>
             <w:r>
               <w:rPr>
@@ -2145,6 +2405,32 @@
                 <w:szCs w:val="19"/>
               </w:rPr>
               <w:t xml:space="preserve">Recovery 4.8 vs 1.4, Blocked.</w:t>
+            </w:r>
+          </w:p>
+          <w:p>
+            <w:pPr>
+              <w:spacing w:after="0"/>
+            </w:pPr>
+            <w:r>
+              <w:rPr>
+                <w:rFonts w:ascii="Calibri" w:cs="Calibri" w:eastAsia="Calibri" w:hAnsi="Calibri"/>
+                <w:b/>
+                <w:bCs/>
+                <w:caps/>
+                <w:color w:val="5B4B8A"/>
+                <w:sz w:val="18"/>
+                <w:szCs w:val="18"/>
+              </w:rPr>
+              <w:t xml:space="preserve">YOU  </w:t>
+            </w:r>
+            <w:r>
+              <w:rPr>
+                <w:rFonts w:ascii="Calibri" w:cs="Calibri" w:eastAsia="Calibri" w:hAnsi="Calibri"/>
+                <w:color w:val="1A2233"/>
+                <w:sz w:val="19"/>
+                <w:szCs w:val="19"/>
+              </w:rPr>
+              <w:t xml:space="preserve">Two hands apart to show the gap, wide on four point eight and low on one point four. Do not bring them together again afterwards.</w:t>
             </w:r>
           </w:p>
         </w:tc>
@@ -2308,7 +2594,7 @@
           </w:tcPr>
           <w:p>
             <w:pPr>
-              <w:spacing w:after="0"/>
+              <w:spacing w:after="80"/>
             </w:pPr>
             <w:r>
               <w:rPr>
@@ -2330,6 +2616,32 @@
                 <w:szCs w:val="19"/>
               </w:rPr>
               <w:t xml:space="preserve">A written brief with Download, Copy, Print or PDF.</w:t>
+            </w:r>
+          </w:p>
+          <w:p>
+            <w:pPr>
+              <w:spacing w:after="0"/>
+            </w:pPr>
+            <w:r>
+              <w:rPr>
+                <w:rFonts w:ascii="Calibri" w:cs="Calibri" w:eastAsia="Calibri" w:hAnsi="Calibri"/>
+                <w:b/>
+                <w:bCs/>
+                <w:caps/>
+                <w:color w:val="5B4B8A"/>
+                <w:sz w:val="18"/>
+                <w:szCs w:val="18"/>
+              </w:rPr>
+              <w:t xml:space="preserve">YOU  </w:t>
+            </w:r>
+            <w:r>
+              <w:rPr>
+                <w:rFonts w:ascii="Calibri" w:cs="Calibri" w:eastAsia="Calibri" w:hAnsi="Calibri"/>
+                <w:color w:val="1A2233"/>
+                <w:sz w:val="19"/>
+                <w:szCs w:val="19"/>
+              </w:rPr>
+              <w:t xml:space="preserve">Pace picks up slightly. This is the part a GM is buying, so sound like you have sold it before.</w:t>
             </w:r>
           </w:p>
         </w:tc>
@@ -2459,7 +2771,7 @@
           </w:tcPr>
           <w:p>
             <w:pPr>
-              <w:spacing w:after="0"/>
+              <w:spacing w:after="80"/>
             </w:pPr>
             <w:r>
               <w:rPr>
@@ -2481,6 +2793,32 @@
                 <w:szCs w:val="19"/>
               </w:rPr>
               <w:t xml:space="preserve">Hands still. Let the last frame sit after you finish.</w:t>
+            </w:r>
+          </w:p>
+          <w:p>
+            <w:pPr>
+              <w:spacing w:after="0"/>
+            </w:pPr>
+            <w:r>
+              <w:rPr>
+                <w:rFonts w:ascii="Calibri" w:cs="Calibri" w:eastAsia="Calibri" w:hAnsi="Calibri"/>
+                <w:b/>
+                <w:bCs/>
+                <w:caps/>
+                <w:color w:val="5B4B8A"/>
+                <w:sz w:val="18"/>
+                <w:szCs w:val="18"/>
+              </w:rPr>
+              <w:t xml:space="preserve">YOU  </w:t>
+            </w:r>
+            <w:r>
+              <w:rPr>
+                <w:rFonts w:ascii="Calibri" w:cs="Calibri" w:eastAsia="Calibri" w:hAnsi="Calibri"/>
+                <w:color w:val="1A2233"/>
+                <w:sz w:val="19"/>
+                <w:szCs w:val="19"/>
+              </w:rPr>
+              <w:t xml:space="preserve">Hands at your sides. Nothing in them. Do not step, do not nod, do not fill the silence. Count three before you move.</w:t>
             </w:r>
           </w:p>
         </w:tc>
@@ -2701,6 +3039,370 @@
         </w:tc>
       </w:tr>
     </w:tbl>
+    <w:p>
+      <w:pPr>
+        <w:pageBreakBefore/>
+      </w:pPr>
+    </w:p>
+    <w:p>
+      <w:pPr>
+        <w:keepNext/>
+        <w:spacing w:after="160" w:before="0"/>
+      </w:pPr>
+      <w:r>
+        <w:rPr>
+          <w:rFonts w:ascii="Calibri" w:cs="Calibri" w:eastAsia="Calibri" w:hAnsi="Calibri"/>
+          <w:b/>
+          <w:bCs/>
+          <w:color w:val="1A2233"/>
+          <w:sz w:val="28"/>
+          <w:szCs w:val="28"/>
+        </w:rPr>
+        <w:t xml:space="preserve">How to perform it</w:t>
+      </w:r>
+    </w:p>
+    <w:p>
+      <w:pPr>
+        <w:spacing w:after="240"/>
+      </w:pPr>
+      <w:r>
+        <w:rPr>
+          <w:rFonts w:ascii="Calibri" w:cs="Calibri" w:eastAsia="Calibri" w:hAnsi="Calibri"/>
+          <w:color w:val="1A2233"/>
+          <w:sz w:val="20"/>
+          <w:szCs w:val="20"/>
+        </w:rPr>
+        <w:t xml:space="preserve">The video runs itself, so the only thing they are watching is you. Three gestures, two gears, three silences. That is the whole performance, and it is deliberately small: a pitch with choreography in it looks rehearsed, and rehearsed looks like you are hiding something.</w:t>
+      </w:r>
+    </w:p>
+    <w:p>
+      <w:pPr>
+        <w:keepNext/>
+        <w:spacing w:after="160" w:before="200"/>
+      </w:pPr>
+      <w:r>
+        <w:rPr>
+          <w:rFonts w:ascii="Calibri" w:cs="Calibri" w:eastAsia="Calibri" w:hAnsi="Calibri"/>
+          <w:b/>
+          <w:bCs/>
+          <w:color w:val="1A2233"/>
+          <w:sz w:val="24"/>
+          <w:szCs w:val="24"/>
+        </w:rPr>
+        <w:t xml:space="preserve">Three gestures, and only these three</w:t>
+      </w:r>
+    </w:p>
+    <w:p>
+      <w:pPr>
+        <w:pStyle w:val="ListParagraph"/>
+        <w:numPr>
+          <w:ilvl w:val="0"/>
+          <w:numId w:val="1"/>
+        </w:numPr>
+        <w:spacing w:after="80"/>
+      </w:pPr>
+      <w:r>
+        <w:rPr>
+          <w:rFonts w:ascii="Calibri" w:cs="Calibri" w:eastAsia="Calibri" w:hAnsi="Calibri"/>
+          <w:color w:val="1A2233"/>
+          <w:sz w:val="20"/>
+          <w:szCs w:val="20"/>
+        </w:rPr>
+        <w:t xml:space="preserve">THE GAP. Two hands apart, one high one low, on four point eight and one point four. Use it once. It is the shape of the entire product.</w:t>
+      </w:r>
+    </w:p>
+    <w:p>
+      <w:pPr>
+        <w:pStyle w:val="ListParagraph"/>
+        <w:numPr>
+          <w:ilvl w:val="0"/>
+          <w:numId w:val="1"/>
+        </w:numPr>
+        <w:spacing w:after="80"/>
+      </w:pPr>
+      <w:r>
+        <w:rPr>
+          <w:rFonts w:ascii="Calibri" w:cs="Calibri" w:eastAsia="Calibri" w:hAnsi="Calibri"/>
+          <w:color w:val="1A2233"/>
+          <w:sz w:val="20"/>
+          <w:szCs w:val="20"/>
+        </w:rPr>
+        <w:t xml:space="preserve">THE STOP. Flat palm out, like stopping traffic, when the system stops and waits for a human. Twice at most: on it stopped, and again if a judge asks about the gate.</w:t>
+      </w:r>
+    </w:p>
+    <w:p>
+      <w:pPr>
+        <w:pStyle w:val="ListParagraph"/>
+        <w:numPr>
+          <w:ilvl w:val="0"/>
+          <w:numId w:val="1"/>
+        </w:numPr>
+        <w:spacing w:after="80"/>
+      </w:pPr>
+      <w:r>
+        <w:rPr>
+          <w:rFonts w:ascii="Calibri" w:cs="Calibri" w:eastAsia="Calibri" w:hAnsi="Calibri"/>
+          <w:color w:val="1A2233"/>
+          <w:sz w:val="20"/>
+          <w:szCs w:val="20"/>
+        </w:rPr>
+        <w:t xml:space="preserve">THE ONE. A single finger on one policy. Hold it up through the rest of the sentence.</w:t>
+      </w:r>
+    </w:p>
+    <w:p>
+      <w:pPr>
+        <w:spacing w:after="200"/>
+      </w:pPr>
+      <w:r>
+        <w:rPr>
+          <w:rFonts w:ascii="Calibri" w:cs="Calibri" w:eastAsia="Calibri" w:hAnsi="Calibri"/>
+          <w:color w:val="1A2233"/>
+          <w:sz w:val="20"/>
+          <w:szCs w:val="20"/>
+        </w:rPr>
+        <w:t xml:space="preserve">Everything else: hands at your sides, or one hand loosely at waist height. If you catch yourself gesturing on ordinary words, drop your hands and carry on.</w:t>
+      </w:r>
+    </w:p>
+    <w:p>
+      <w:pPr>
+        <w:keepNext/>
+        <w:spacing w:after="160" w:before="360"/>
+      </w:pPr>
+      <w:r>
+        <w:rPr>
+          <w:rFonts w:ascii="Calibri" w:cs="Calibri" w:eastAsia="Calibri" w:hAnsi="Calibri"/>
+          <w:b/>
+          <w:bCs/>
+          <w:color w:val="1A2233"/>
+          <w:sz w:val="24"/>
+          <w:szCs w:val="24"/>
+        </w:rPr>
+        <w:t xml:space="preserve">Two gears</w:t>
+      </w:r>
+    </w:p>
+    <w:p>
+      <w:pPr>
+        <w:spacing w:after="120"/>
+      </w:pPr>
+      <w:r>
+        <w:rPr>
+          <w:rFonts w:ascii="Calibri" w:cs="Calibri" w:eastAsia="Calibri" w:hAnsi="Calibri"/>
+          <w:color w:val="1A2233"/>
+          <w:sz w:val="20"/>
+          <w:szCs w:val="20"/>
+        </w:rPr>
+        <w:t xml:space="preserve">Gear one, flat and unhurried, for everything up to 0:36. You are laying out facts and you are slightly bored by how obvious they are. Gear two, warmer and slower, from the Aug 30 screen onward. Not louder. Slower.</w:t>
+      </w:r>
+    </w:p>
+    <w:p>
+      <w:pPr>
+        <w:spacing w:after="200"/>
+      </w:pPr>
+      <w:r>
+        <w:rPr>
+          <w:rFonts w:ascii="Calibri" w:cs="Calibri" w:eastAsia="Calibri" w:hAnsi="Calibri"/>
+          <w:color w:val="1A2233"/>
+          <w:sz w:val="20"/>
+          <w:szCs w:val="20"/>
+        </w:rPr>
+        <w:t xml:space="preserve">The one place to speed up is the GM brief at 1:42, which should sound like somebody who has sold this before, and then drop back down for the close.</w:t>
+      </w:r>
+    </w:p>
+    <w:p>
+      <w:pPr>
+        <w:keepNext/>
+        <w:spacing w:after="160" w:before="360"/>
+      </w:pPr>
+      <w:r>
+        <w:rPr>
+          <w:rFonts w:ascii="Calibri" w:cs="Calibri" w:eastAsia="Calibri" w:hAnsi="Calibri"/>
+          <w:b/>
+          <w:bCs/>
+          <w:color w:val="1A2233"/>
+          <w:sz w:val="24"/>
+          <w:szCs w:val="24"/>
+        </w:rPr>
+        <w:t xml:space="preserve">Three silences, and they are the hardest part</w:t>
+      </w:r>
+    </w:p>
+    <w:p>
+      <w:pPr>
+        <w:pStyle w:val="ListParagraph"/>
+        <w:numPr>
+          <w:ilvl w:val="0"/>
+          <w:numId w:val="1"/>
+        </w:numPr>
+        <w:spacing w:after="80"/>
+      </w:pPr>
+      <w:r>
+        <w:rPr>
+          <w:rFonts w:ascii="Calibri" w:cs="Calibri" w:eastAsia="Calibri" w:hAnsi="Calibri"/>
+          <w:color w:val="1A2233"/>
+          <w:sz w:val="20"/>
+          <w:szCs w:val="20"/>
+        </w:rPr>
+        <w:t xml:space="preserve">Two seconds before the Aug 30 screen. You have just said leading on all three, flat. Let it sit.</w:t>
+      </w:r>
+    </w:p>
+    <w:p>
+      <w:pPr>
+        <w:pStyle w:val="ListParagraph"/>
+        <w:numPr>
+          <w:ilvl w:val="0"/>
+          <w:numId w:val="1"/>
+        </w:numPr>
+        <w:spacing w:after="80"/>
+      </w:pPr>
+      <w:r>
+        <w:rPr>
+          <w:rFonts w:ascii="Calibri" w:cs="Calibri" w:eastAsia="Calibri" w:hAnsi="Calibri"/>
+          <w:color w:val="1A2233"/>
+          <w:sz w:val="20"/>
+          <w:szCs w:val="20"/>
+        </w:rPr>
+        <w:t xml:space="preserve">Two seconds after training worked. Do not explain it. The next screen explains it.</w:t>
+      </w:r>
+    </w:p>
+    <w:p>
+      <w:pPr>
+        <w:pStyle w:val="ListParagraph"/>
+        <w:numPr>
+          <w:ilvl w:val="0"/>
+          <w:numId w:val="1"/>
+        </w:numPr>
+        <w:spacing w:after="80"/>
+      </w:pPr>
+      <w:r>
+        <w:rPr>
+          <w:rFonts w:ascii="Calibri" w:cs="Calibri" w:eastAsia="Calibri" w:hAnsi="Calibri"/>
+          <w:color w:val="1A2233"/>
+          <w:sz w:val="20"/>
+          <w:szCs w:val="20"/>
+        </w:rPr>
+        <w:t xml:space="preserve">Three seconds after the last word, before you touch anything. Count them.</w:t>
+      </w:r>
+    </w:p>
+    <w:p>
+      <w:pPr>
+        <w:spacing w:after="200"/>
+      </w:pPr>
+      <w:r>
+        <w:rPr>
+          <w:rFonts w:ascii="Calibri" w:cs="Calibri" w:eastAsia="Calibri" w:hAnsi="Calibri"/>
+          <w:color w:val="1A2233"/>
+          <w:sz w:val="20"/>
+          <w:szCs w:val="20"/>
+        </w:rPr>
+        <w:t xml:space="preserve">Silence feels about three times longer on stage than it does in the room. It will feel like you have forgotten your line. You have not.</w:t>
+      </w:r>
+    </w:p>
+    <w:p>
+      <w:pPr>
+        <w:keepNext/>
+        <w:spacing w:after="160" w:before="360"/>
+      </w:pPr>
+      <w:r>
+        <w:rPr>
+          <w:rFonts w:ascii="Calibri" w:cs="Calibri" w:eastAsia="Calibri" w:hAnsi="Calibri"/>
+          <w:b/>
+          <w:bCs/>
+          <w:color w:val="1A2233"/>
+          <w:sz w:val="24"/>
+          <w:szCs w:val="24"/>
+        </w:rPr>
+        <w:t xml:space="preserve">Where to stand</w:t>
+      </w:r>
+    </w:p>
+    <w:p>
+      <w:pPr>
+        <w:spacing w:after="120"/>
+      </w:pPr>
+      <w:r>
+        <w:rPr>
+          <w:rFonts w:ascii="Calibri" w:cs="Calibri" w:eastAsia="Calibri" w:hAnsi="Calibri"/>
+          <w:color w:val="1A2233"/>
+          <w:sz w:val="20"/>
+          <w:szCs w:val="20"/>
+        </w:rPr>
+        <w:t xml:space="preserve">Beside the screen, never in front of it, and angled so you can see their faces without turning your back. Move once, on the Aug 30 line, one step toward them. A presenter who moves once is emphatic. A presenter who paces is nervous.</w:t>
+      </w:r>
+    </w:p>
+    <w:p>
+      <w:pPr>
+        <w:spacing w:after="200"/>
+      </w:pPr>
+      <w:r>
+        <w:rPr>
+          <w:rFonts w:ascii="Calibri" w:cs="Calibri" w:eastAsia="Calibri" w:hAnsi="Calibri"/>
+          <w:color w:val="1A2233"/>
+          <w:sz w:val="20"/>
+          <w:szCs w:val="20"/>
+        </w:rPr>
+        <w:t xml:space="preserve">Do not read the screen aloud. They can read. Your job is to say the thing that is NOT on the screen.</w:t>
+      </w:r>
+    </w:p>
+    <w:p>
+      <w:pPr>
+        <w:keepNext/>
+        <w:spacing w:after="160" w:before="360"/>
+      </w:pPr>
+      <w:r>
+        <w:rPr>
+          <w:rFonts w:ascii="Calibri" w:cs="Calibri" w:eastAsia="Calibri" w:hAnsi="Calibri"/>
+          <w:b/>
+          <w:bCs/>
+          <w:color w:val="1A2233"/>
+          <w:sz w:val="24"/>
+          <w:szCs w:val="24"/>
+        </w:rPr>
+        <w:t xml:space="preserve">The joke</w:t>
+      </w:r>
+    </w:p>
+    <w:p>
+      <w:pPr>
+        <w:spacing w:after="200"/>
+      </w:pPr>
+      <w:r>
+        <w:rPr>
+          <w:rFonts w:ascii="Calibri" w:cs="Calibri" w:eastAsia="Calibri" w:hAnsi="Calibri"/>
+          <w:color w:val="1A2233"/>
+          <w:sz w:val="20"/>
+          <w:szCs w:val="20"/>
+        </w:rPr>
+        <w:t xml:space="preserve">One joke, at 1:30, and only if the room has already warmed. Deliver it completely flat, do not smile at your own line, and move straight on without waiting for the laugh. If it lands you get the room. If it does not, nobody noticed you told a joke.</w:t>
+      </w:r>
+    </w:p>
+    <w:p>
+      <w:pPr>
+        <w:keepNext/>
+        <w:spacing w:after="160" w:before="360"/>
+      </w:pPr>
+      <w:r>
+        <w:rPr>
+          <w:rFonts w:ascii="Calibri" w:cs="Calibri" w:eastAsia="Calibri" w:hAnsi="Calibri"/>
+          <w:b/>
+          <w:bCs/>
+          <w:color w:val="1A2233"/>
+          <w:sz w:val="24"/>
+          <w:szCs w:val="24"/>
+        </w:rPr>
+        <w:t xml:space="preserve">If your hands shake or your mouth dries</w:t>
+      </w:r>
+    </w:p>
+    <w:p>
+      <w:pPr>
+        <w:spacing w:after="200"/>
+      </w:pPr>
+      <w:r>
+        <w:rPr>
+          <w:rFonts w:ascii="Calibri" w:cs="Calibri" w:eastAsia="Calibri" w:hAnsi="Calibri"/>
+          <w:color w:val="1A2233"/>
+          <w:sz w:val="20"/>
+          <w:szCs w:val="20"/>
+        </w:rPr>
+        <w:t xml:space="preserve">Both are normal and neither is visible from four metres. Put the laptop between you and them so your hands have somewhere to be. Take the breath before Last Tuesday, not during it. And remember the video cannot fail: whatever happens to you, the product on screen keeps working.</w:t>
+      </w:r>
+    </w:p>
     <w:p>
       <w:pPr>
         <w:pageBreakBefore/>

</xml_diff>